<commit_message>
Revert "Merge branch 'development' into gathering-dll"
This reverts commit 66279ec9efddc0608c29d05b77815de0667f6a01, reversing
changes made to 845348c4e4adb1261f9ad4a0432c98e7e9b3d90f.
</commit_message>
<xml_diff>
--- a/Document/@01.SDP_Raywatt.docx
+++ b/Document/@01.SDP_Raywatt.docx
@@ -139,19 +139,11 @@
       <w:proofErr w:type="spellStart"/>
       <w:r>
         <w:rPr>
-          <w:rFonts w:asciiTheme="minorEastAsia" w:eastAsiaTheme="minorEastAsia" w:hAnsiTheme="minorEastAsia" w:hint="eastAsia"/>
+          <w:rFonts w:asciiTheme="minorEastAsia" w:eastAsiaTheme="minorEastAsia" w:hAnsiTheme="minorEastAsia"/>
           <w:sz w:val="24"/>
           <w:szCs w:val="24"/>
         </w:rPr>
-        <w:t>F</w:t>
-      </w:r>
-      <w:r>
-        <w:rPr>
-          <w:rFonts w:asciiTheme="minorEastAsia" w:eastAsiaTheme="minorEastAsia" w:hAnsiTheme="minorEastAsia"/>
-          <w:sz w:val="24"/>
-          <w:szCs w:val="24"/>
-        </w:rPr>
-        <w:t>asterDx</w:t>
+        <w:t>Rudens</w:t>
       </w:r>
       <w:proofErr w:type="spellEnd"/>
     </w:p>
@@ -178,11 +170,19 @@
       </w:r>
       <w:r>
         <w:rPr>
+          <w:rFonts w:asciiTheme="minorEastAsia" w:eastAsiaTheme="minorEastAsia" w:hAnsiTheme="minorEastAsia" w:cs="Arial" w:hint="eastAsia"/>
+          <w:b/>
+          <w:sz w:val="24"/>
+        </w:rPr>
+        <w:t>F</w:t>
+      </w:r>
+      <w:r>
+        <w:rPr>
           <w:rFonts w:asciiTheme="minorEastAsia" w:eastAsiaTheme="minorEastAsia" w:hAnsiTheme="minorEastAsia" w:cs="Arial"/>
           <w:b/>
           <w:sz w:val="24"/>
         </w:rPr>
-        <w:t>FASTER</w:t>
+        <w:t>aster</w:t>
       </w:r>
     </w:p>
     <w:p>
@@ -280,7 +280,7 @@
         </w:trPr>
         <w:tc>
           <w:tcPr>
-            <w:tcW w:w="2410" w:type="dxa"/>
+            <w:tcW w:w="2278" w:type="dxa"/>
             <w:shd w:val="clear" w:color="auto" w:fill="FFFFFF" w:themeFill="background1"/>
             <w:vAlign w:val="center"/>
           </w:tcPr>
@@ -301,7 +301,7 @@
         </w:tc>
         <w:tc>
           <w:tcPr>
-            <w:tcW w:w="2409" w:type="dxa"/>
+            <w:tcW w:w="2278" w:type="dxa"/>
             <w:shd w:val="clear" w:color="auto" w:fill="FFFFFF" w:themeFill="background1"/>
             <w:vAlign w:val="center"/>
           </w:tcPr>
@@ -330,7 +330,7 @@
         </w:tc>
         <w:tc>
           <w:tcPr>
-            <w:tcW w:w="2410" w:type="dxa"/>
+            <w:tcW w:w="2279" w:type="dxa"/>
             <w:tcBorders>
               <w:bottom w:val="single" w:sz="4" w:space="0" w:color="auto"/>
             </w:tcBorders>
@@ -362,7 +362,7 @@
         </w:tc>
         <w:tc>
           <w:tcPr>
-            <w:tcW w:w="2410" w:type="dxa"/>
+            <w:tcW w:w="2279" w:type="dxa"/>
             <w:shd w:val="clear" w:color="auto" w:fill="FFFFFF" w:themeFill="background1"/>
             <w:vAlign w:val="center"/>
           </w:tcPr>
@@ -397,7 +397,7 @@
         </w:trPr>
         <w:tc>
           <w:tcPr>
-            <w:tcW w:w="2410" w:type="dxa"/>
+            <w:tcW w:w="2278" w:type="dxa"/>
             <w:shd w:val="clear" w:color="auto" w:fill="FFFFFF" w:themeFill="background1"/>
             <w:vAlign w:val="center"/>
           </w:tcPr>
@@ -426,7 +426,7 @@
         </w:tc>
         <w:tc>
           <w:tcPr>
-            <w:tcW w:w="2409" w:type="dxa"/>
+            <w:tcW w:w="2278" w:type="dxa"/>
             <w:shd w:val="clear" w:color="auto" w:fill="FFFFFF" w:themeFill="background1"/>
             <w:vAlign w:val="center"/>
           </w:tcPr>
@@ -445,23 +445,16 @@
             </w:pPr>
             <w:r>
               <w:rPr>
-                <w:rFonts w:asciiTheme="minorEastAsia" w:eastAsiaTheme="minorEastAsia" w:hAnsiTheme="minorEastAsia" w:cs="Arial"/>
+                <w:rFonts w:asciiTheme="minorEastAsia" w:hAnsiTheme="minorEastAsia" w:cs="Arial"/>
                 <w:b/>
+                <w:noProof/>
                 <w:sz w:val="24"/>
               </w:rPr>
               <w:drawing>
-                <wp:anchor distT="0" distB="0" distL="114300" distR="114300" simplePos="0" relativeHeight="251660288" behindDoc="0" locked="0" layoutInCell="1" allowOverlap="1" wp14:anchorId="6B92C4F3" wp14:editId="620CFF9D">
-                  <wp:simplePos x="0" y="0"/>
-                  <wp:positionH relativeFrom="column">
-                    <wp:posOffset>103505</wp:posOffset>
-                  </wp:positionH>
-                  <wp:positionV relativeFrom="paragraph">
-                    <wp:posOffset>-3810</wp:posOffset>
-                  </wp:positionV>
-                  <wp:extent cx="1257300" cy="791210"/>
-                  <wp:effectExtent l="0" t="0" r="0" b="8890"/>
-                  <wp:wrapNone/>
-                  <wp:docPr id="1954846925" name="그림 1"/>
+                <wp:inline distT="0" distB="0" distL="0" distR="0" wp14:anchorId="0D6EE16F" wp14:editId="71CB1652">
+                  <wp:extent cx="771525" cy="1031590"/>
+                  <wp:effectExtent l="0" t="0" r="0" b="0"/>
+                  <wp:docPr id="3" name="Picture 3"/>
                   <wp:cNvGraphicFramePr>
                     <a:graphicFrameLocks xmlns:a="http://schemas.openxmlformats.org/drawingml/2006/main" noChangeAspect="1"/>
                   </wp:cNvGraphicFramePr>
@@ -469,17 +462,11 @@
                     <a:graphicData uri="http://schemas.openxmlformats.org/drawingml/2006/picture">
                       <pic:pic xmlns:pic="http://schemas.openxmlformats.org/drawingml/2006/picture">
                         <pic:nvPicPr>
-                          <pic:cNvPr id="1954846925" name=""/>
+                          <pic:cNvPr id="1" name=""/>
                           <pic:cNvPicPr/>
                         </pic:nvPicPr>
                         <pic:blipFill>
-                          <a:blip r:embed="rId8">
-                            <a:extLst>
-                              <a:ext uri="{28A0092B-C50C-407E-A947-70E740481C1C}">
-                                <a14:useLocalDpi xmlns:a14="http://schemas.microsoft.com/office/drawing/2010/main" val="0"/>
-                              </a:ext>
-                            </a:extLst>
-                          </a:blip>
+                          <a:blip r:embed="rId8"/>
                           <a:stretch>
                             <a:fillRect/>
                           </a:stretch>
@@ -487,7 +474,7 @@
                         <pic:spPr>
                           <a:xfrm>
                             <a:off x="0" y="0"/>
-                            <a:ext cx="1257300" cy="791210"/>
+                            <a:ext cx="780144" cy="1043114"/>
                           </a:xfrm>
                           <a:prstGeom prst="rect">
                             <a:avLst/>
@@ -496,20 +483,14 @@
                       </pic:pic>
                     </a:graphicData>
                   </a:graphic>
-                  <wp14:sizeRelH relativeFrom="margin">
-                    <wp14:pctWidth>0</wp14:pctWidth>
-                  </wp14:sizeRelH>
-                  <wp14:sizeRelV relativeFrom="margin">
-                    <wp14:pctHeight>0</wp14:pctHeight>
-                  </wp14:sizeRelV>
-                </wp:anchor>
+                </wp:inline>
               </w:drawing>
             </w:r>
           </w:p>
         </w:tc>
         <w:tc>
           <w:tcPr>
-            <w:tcW w:w="2410" w:type="dxa"/>
+            <w:tcW w:w="2279" w:type="dxa"/>
             <w:tcBorders>
               <w:tr2bl w:val="nil"/>
             </w:tcBorders>
@@ -531,23 +512,16 @@
             </w:pPr>
             <w:r>
               <w:rPr>
-                <w:rFonts w:asciiTheme="minorEastAsia" w:eastAsiaTheme="minorEastAsia" w:hAnsiTheme="minorEastAsia" w:cs="Arial"/>
+                <w:rFonts w:asciiTheme="minorEastAsia" w:hAnsiTheme="minorEastAsia" w:cs="Arial"/>
                 <w:b/>
+                <w:noProof/>
                 <w:sz w:val="24"/>
               </w:rPr>
               <w:drawing>
-                <wp:anchor distT="0" distB="0" distL="114300" distR="114300" simplePos="0" relativeHeight="251658240" behindDoc="0" locked="0" layoutInCell="1" allowOverlap="1" wp14:anchorId="3020FEF1" wp14:editId="13568B59">
-                  <wp:simplePos x="0" y="0"/>
-                  <wp:positionH relativeFrom="column">
-                    <wp:posOffset>170180</wp:posOffset>
-                  </wp:positionH>
-                  <wp:positionV relativeFrom="paragraph">
-                    <wp:posOffset>-8890</wp:posOffset>
-                  </wp:positionV>
-                  <wp:extent cx="1095375" cy="816610"/>
-                  <wp:effectExtent l="0" t="0" r="9525" b="2540"/>
-                  <wp:wrapNone/>
-                  <wp:docPr id="761790498" name="그림 1"/>
+                <wp:inline distT="0" distB="0" distL="0" distR="0" wp14:anchorId="4701B9EF" wp14:editId="2846DA6C">
+                  <wp:extent cx="1285875" cy="819893"/>
+                  <wp:effectExtent l="0" t="0" r="0" b="0"/>
+                  <wp:docPr id="6" name="Picture 6"/>
                   <wp:cNvGraphicFramePr>
                     <a:graphicFrameLocks xmlns:a="http://schemas.openxmlformats.org/drawingml/2006/main" noChangeAspect="1"/>
                   </wp:cNvGraphicFramePr>
@@ -555,17 +529,11 @@
                     <a:graphicData uri="http://schemas.openxmlformats.org/drawingml/2006/picture">
                       <pic:pic xmlns:pic="http://schemas.openxmlformats.org/drawingml/2006/picture">
                         <pic:nvPicPr>
-                          <pic:cNvPr id="761790498" name=""/>
+                          <pic:cNvPr id="1" name=""/>
                           <pic:cNvPicPr/>
                         </pic:nvPicPr>
                         <pic:blipFill>
-                          <a:blip r:embed="rId9">
-                            <a:extLst>
-                              <a:ext uri="{28A0092B-C50C-407E-A947-70E740481C1C}">
-                                <a14:useLocalDpi xmlns:a14="http://schemas.microsoft.com/office/drawing/2010/main" val="0"/>
-                              </a:ext>
-                            </a:extLst>
-                          </a:blip>
+                          <a:blip r:embed="rId9"/>
                           <a:stretch>
                             <a:fillRect/>
                           </a:stretch>
@@ -573,7 +541,7 @@
                         <pic:spPr>
                           <a:xfrm>
                             <a:off x="0" y="0"/>
-                            <a:ext cx="1095375" cy="816610"/>
+                            <a:ext cx="1294747" cy="825550"/>
                           </a:xfrm>
                           <a:prstGeom prst="rect">
                             <a:avLst/>
@@ -582,20 +550,14 @@
                       </pic:pic>
                     </a:graphicData>
                   </a:graphic>
-                  <wp14:sizeRelH relativeFrom="margin">
-                    <wp14:pctWidth>0</wp14:pctWidth>
-                  </wp14:sizeRelH>
-                  <wp14:sizeRelV relativeFrom="margin">
-                    <wp14:pctHeight>0</wp14:pctHeight>
-                  </wp14:sizeRelV>
-                </wp:anchor>
+                </wp:inline>
               </w:drawing>
             </w:r>
           </w:p>
         </w:tc>
         <w:tc>
           <w:tcPr>
-            <w:tcW w:w="2410" w:type="dxa"/>
+            <w:tcW w:w="2279" w:type="dxa"/>
             <w:shd w:val="clear" w:color="auto" w:fill="FFFFFF" w:themeFill="background1"/>
             <w:vAlign w:val="center"/>
           </w:tcPr>
@@ -621,17 +583,9 @@
                 <w:sz w:val="24"/>
               </w:rPr>
               <w:drawing>
-                <wp:anchor distT="0" distB="0" distL="114300" distR="114300" simplePos="0" relativeHeight="251659264" behindDoc="0" locked="0" layoutInCell="1" allowOverlap="1" wp14:anchorId="161C9D1D" wp14:editId="33CA93B0">
-                  <wp:simplePos x="0" y="0"/>
-                  <wp:positionH relativeFrom="column">
-                    <wp:posOffset>297815</wp:posOffset>
-                  </wp:positionH>
-                  <wp:positionV relativeFrom="paragraph">
-                    <wp:posOffset>2540</wp:posOffset>
-                  </wp:positionV>
+                <wp:inline distT="0" distB="0" distL="0" distR="0" wp14:anchorId="161C9D1D" wp14:editId="62C41B9A">
                   <wp:extent cx="884993" cy="828675"/>
                   <wp:effectExtent l="0" t="0" r="0" b="0"/>
-                  <wp:wrapNone/>
                   <wp:docPr id="2" name="Picture 2"/>
                   <wp:cNvGraphicFramePr>
                     <a:graphicFrameLocks xmlns:a="http://schemas.openxmlformats.org/drawingml/2006/main" noChangeAspect="1"/>
@@ -644,13 +598,7 @@
                           <pic:cNvPicPr/>
                         </pic:nvPicPr>
                         <pic:blipFill>
-                          <a:blip r:embed="rId10">
-                            <a:extLst>
-                              <a:ext uri="{28A0092B-C50C-407E-A947-70E740481C1C}">
-                                <a14:useLocalDpi xmlns:a14="http://schemas.microsoft.com/office/drawing/2010/main" val="0"/>
-                              </a:ext>
-                            </a:extLst>
-                          </a:blip>
+                          <a:blip r:embed="rId10"/>
                           <a:stretch>
                             <a:fillRect/>
                           </a:stretch>
@@ -658,7 +606,7 @@
                         <pic:spPr>
                           <a:xfrm>
                             <a:off x="0" y="0"/>
-                            <a:ext cx="884993" cy="828675"/>
+                            <a:ext cx="887888" cy="831386"/>
                           </a:xfrm>
                           <a:prstGeom prst="rect">
                             <a:avLst/>
@@ -667,7 +615,7 @@
                       </pic:pic>
                     </a:graphicData>
                   </a:graphic>
-                </wp:anchor>
+                </wp:inline>
               </w:drawing>
             </w:r>
           </w:p>
@@ -680,7 +628,7 @@
         </w:trPr>
         <w:tc>
           <w:tcPr>
-            <w:tcW w:w="2410" w:type="dxa"/>
+            <w:tcW w:w="2278" w:type="dxa"/>
             <w:tcBorders>
               <w:bottom w:val="single" w:sz="4" w:space="0" w:color="auto"/>
             </w:tcBorders>
@@ -712,7 +660,7 @@
         </w:tc>
         <w:tc>
           <w:tcPr>
-            <w:tcW w:w="2409" w:type="dxa"/>
+            <w:tcW w:w="2278" w:type="dxa"/>
             <w:tcBorders>
               <w:bottom w:val="single" w:sz="4" w:space="0" w:color="auto"/>
             </w:tcBorders>
@@ -738,14 +686,60 @@
                 <w:rFonts w:asciiTheme="minorEastAsia" w:eastAsiaTheme="minorEastAsia" w:hAnsiTheme="minorEastAsia" w:cs="Arial"/>
                 <w:b/>
                 <w:sz w:val="24"/>
-              </w:rPr>
-              <w:t>2023.07.28</w:t>
+                <w:highlight w:val="yellow"/>
+              </w:rPr>
+              <w:t>202</w:t>
+            </w:r>
+            <w:r>
+              <w:rPr>
+                <w:rFonts w:asciiTheme="minorEastAsia" w:eastAsiaTheme="minorEastAsia" w:hAnsiTheme="minorEastAsia" w:cs="Arial"/>
+                <w:b/>
+                <w:sz w:val="24"/>
+                <w:highlight w:val="yellow"/>
+              </w:rPr>
+              <w:t>3</w:t>
+            </w:r>
+            <w:r>
+              <w:rPr>
+                <w:rFonts w:asciiTheme="minorEastAsia" w:eastAsiaTheme="minorEastAsia" w:hAnsiTheme="minorEastAsia" w:cs="Arial"/>
+                <w:b/>
+                <w:sz w:val="24"/>
+                <w:highlight w:val="yellow"/>
+              </w:rPr>
+              <w:t>.0</w:t>
+            </w:r>
+            <w:r>
+              <w:rPr>
+                <w:rFonts w:asciiTheme="minorEastAsia" w:eastAsiaTheme="minorEastAsia" w:hAnsiTheme="minorEastAsia" w:cs="Arial"/>
+                <w:b/>
+                <w:sz w:val="24"/>
+                <w:highlight w:val="yellow"/>
+              </w:rPr>
+              <w:t>7</w:t>
+            </w:r>
+            <w:r>
+              <w:rPr>
+                <w:rFonts w:asciiTheme="minorEastAsia" w:eastAsiaTheme="minorEastAsia" w:hAnsiTheme="minorEastAsia" w:cs="Arial"/>
+                <w:b/>
+                <w:sz w:val="24"/>
+                <w:highlight w:val="yellow"/>
+              </w:rPr>
+              <w:t>.</w:t>
+            </w:r>
+            <w:r>
+              <w:rPr>
+                <w:rFonts w:asciiTheme="minorEastAsia" w:eastAsiaTheme="minorEastAsia" w:hAnsiTheme="minorEastAsia" w:cs="Arial"/>
+                <w:b/>
+                <w:sz w:val="24"/>
+                <w:highlight w:val="yellow"/>
+              </w:rPr>
+              <w:t>28</w:t>
             </w:r>
           </w:p>
         </w:tc>
         <w:tc>
           <w:tcPr>
-            <w:tcW w:w="2410" w:type="dxa"/>
+            <w:tcW w:w="2279" w:type="dxa"/>
             <w:tcBorders>
               <w:bottom w:val="single" w:sz="4" w:space="0" w:color="auto"/>
             </w:tcBorders>
@@ -771,14 +765,42 @@
                 <w:rFonts w:asciiTheme="minorEastAsia" w:eastAsiaTheme="minorEastAsia" w:hAnsiTheme="minorEastAsia" w:cs="Arial"/>
                 <w:b/>
                 <w:sz w:val="24"/>
-              </w:rPr>
-              <w:t>2023.08.04</w:t>
+                <w:highlight w:val="yellow"/>
+              </w:rPr>
+              <w:t>202</w:t>
+            </w:r>
+            <w:r>
+              <w:rPr>
+                <w:rFonts w:asciiTheme="minorEastAsia" w:eastAsiaTheme="minorEastAsia" w:hAnsiTheme="minorEastAsia" w:cs="Arial"/>
+                <w:b/>
+                <w:sz w:val="24"/>
+                <w:highlight w:val="yellow"/>
+              </w:rPr>
+              <w:t>3</w:t>
+            </w:r>
+            <w:r>
+              <w:rPr>
+                <w:rFonts w:asciiTheme="minorEastAsia" w:eastAsiaTheme="minorEastAsia" w:hAnsiTheme="minorEastAsia" w:cs="Arial"/>
+                <w:b/>
+                <w:sz w:val="24"/>
+                <w:highlight w:val="yellow"/>
+              </w:rPr>
+              <w:t>.0</w:t>
+            </w:r>
+            <w:r>
+              <w:rPr>
+                <w:rFonts w:asciiTheme="minorEastAsia" w:eastAsiaTheme="minorEastAsia" w:hAnsiTheme="minorEastAsia" w:cs="Arial"/>
+                <w:b/>
+                <w:sz w:val="24"/>
+                <w:highlight w:val="yellow"/>
+              </w:rPr>
+              <w:t>0.00</w:t>
             </w:r>
           </w:p>
         </w:tc>
         <w:tc>
           <w:tcPr>
-            <w:tcW w:w="2410" w:type="dxa"/>
+            <w:tcW w:w="2279" w:type="dxa"/>
             <w:tcBorders>
               <w:bottom w:val="single" w:sz="4" w:space="0" w:color="auto"/>
             </w:tcBorders>
@@ -804,8 +826,54 @@
                 <w:rFonts w:asciiTheme="minorEastAsia" w:eastAsiaTheme="minorEastAsia" w:hAnsiTheme="minorEastAsia" w:cs="Arial"/>
                 <w:b/>
                 <w:sz w:val="24"/>
-              </w:rPr>
-              <w:t>2023.08.11</w:t>
+                <w:highlight w:val="yellow"/>
+              </w:rPr>
+              <w:t>202</w:t>
+            </w:r>
+            <w:r>
+              <w:rPr>
+                <w:rFonts w:asciiTheme="minorEastAsia" w:eastAsiaTheme="minorEastAsia" w:hAnsiTheme="minorEastAsia" w:cs="Arial"/>
+                <w:b/>
+                <w:sz w:val="24"/>
+                <w:highlight w:val="yellow"/>
+              </w:rPr>
+              <w:t>3</w:t>
+            </w:r>
+            <w:r>
+              <w:rPr>
+                <w:rFonts w:asciiTheme="minorEastAsia" w:eastAsiaTheme="minorEastAsia" w:hAnsiTheme="minorEastAsia" w:cs="Arial"/>
+                <w:b/>
+                <w:sz w:val="24"/>
+                <w:highlight w:val="yellow"/>
+              </w:rPr>
+              <w:t>.</w:t>
+            </w:r>
+            <w:r>
+              <w:rPr>
+                <w:rFonts w:asciiTheme="minorEastAsia" w:eastAsiaTheme="minorEastAsia" w:hAnsiTheme="minorEastAsia" w:cs="Arial"/>
+                <w:b/>
+                <w:sz w:val="24"/>
+                <w:highlight w:val="yellow"/>
+              </w:rPr>
+              <w:t>00</w:t>
+            </w:r>
+            <w:r>
+              <w:rPr>
+                <w:rFonts w:asciiTheme="minorEastAsia" w:eastAsiaTheme="minorEastAsia" w:hAnsiTheme="minorEastAsia" w:cs="Arial"/>
+                <w:b/>
+                <w:sz w:val="24"/>
+                <w:highlight w:val="yellow"/>
+              </w:rPr>
+              <w:t>.</w:t>
+            </w:r>
+            <w:r>
+              <w:rPr>
+                <w:rFonts w:asciiTheme="minorEastAsia" w:eastAsiaTheme="minorEastAsia" w:hAnsiTheme="minorEastAsia" w:cs="Arial"/>
+                <w:b/>
+                <w:sz w:val="24"/>
+                <w:highlight w:val="yellow"/>
+              </w:rPr>
+              <w:t>00</w:t>
             </w:r>
           </w:p>
         </w:tc>
@@ -17318,7 +17386,7 @@
                 <w:sz w:val="22"/>
                 <w:szCs w:val="22"/>
               </w:rPr>
-              <w:t>FASTER</w:t>
+              <w:t>Faster</w:t>
             </w:r>
           </w:p>
         </w:tc>
@@ -17738,13 +17806,13 @@
         <w:tblLook w:val="04A0" w:firstRow="1" w:lastRow="0" w:firstColumn="1" w:lastColumn="0" w:noHBand="0" w:noVBand="1"/>
       </w:tblPr>
       <w:tblGrid>
-        <w:gridCol w:w="3260"/>
-        <w:gridCol w:w="5245"/>
+        <w:gridCol w:w="3969"/>
+        <w:gridCol w:w="4536"/>
       </w:tblGrid>
       <w:tr>
         <w:tc>
           <w:tcPr>
-            <w:tcW w:w="3260" w:type="dxa"/>
+            <w:tcW w:w="3969" w:type="dxa"/>
           </w:tcPr>
           <w:p>
             <w:pPr>
@@ -17766,7 +17834,7 @@
         </w:tc>
         <w:tc>
           <w:tcPr>
-            <w:tcW w:w="5245" w:type="dxa"/>
+            <w:tcW w:w="4536" w:type="dxa"/>
           </w:tcPr>
           <w:p>
             <w:pPr>
@@ -17791,7 +17859,7 @@
       <w:tr>
         <w:tc>
           <w:tcPr>
-            <w:tcW w:w="3260" w:type="dxa"/>
+            <w:tcW w:w="3969" w:type="dxa"/>
           </w:tcPr>
           <w:p>
             <w:pPr>
@@ -17804,15 +17872,16 @@
             <w:r>
               <w:rPr>
                 <w:rFonts w:hAnsi="바탕"/>
+                <w:noProof/>
                 <w:szCs w:val="20"/>
               </w:rPr>
-              <w:t>Frame rate</w:t>
+              <w:t>A-Scan rate</w:t>
             </w:r>
           </w:p>
         </w:tc>
         <w:tc>
           <w:tcPr>
-            <w:tcW w:w="5245" w:type="dxa"/>
+            <w:tcW w:w="4536" w:type="dxa"/>
           </w:tcPr>
           <w:p>
             <w:pPr>
@@ -17826,16 +17895,26 @@
             <w:r>
               <w:rPr>
                 <w:rFonts w:hAnsi="바탕"/>
+                <w:noProof/>
                 <w:szCs w:val="20"/>
               </w:rPr>
-              <w:t>24</w:t>
+              <w:t>200</w:t>
             </w:r>
             <w:r>
               <w:rPr>
                 <w:rFonts w:hAnsi="바탕"/>
+                <w:noProof/>
                 <w:szCs w:val="20"/>
               </w:rPr>
-              <w:t>000 rpm ± 2 %</w:t>
+              <w:t xml:space="preserve"> </w:t>
+            </w:r>
+            <w:r>
+              <w:rPr>
+                <w:rFonts w:hAnsi="바탕"/>
+                <w:noProof/>
+                <w:szCs w:val="20"/>
+              </w:rPr>
+              <w:t>kHz ± 10%</w:t>
             </w:r>
           </w:p>
         </w:tc>
@@ -17843,7 +17922,7 @@
       <w:tr>
         <w:tc>
           <w:tcPr>
-            <w:tcW w:w="3260" w:type="dxa"/>
+            <w:tcW w:w="3969" w:type="dxa"/>
           </w:tcPr>
           <w:p>
             <w:pPr>
@@ -17859,13 +17938,13 @@
                 <w:noProof/>
                 <w:szCs w:val="20"/>
               </w:rPr>
-              <w:t>Laser Class</w:t>
+              <w:t>Axial resolution</w:t>
             </w:r>
           </w:p>
         </w:tc>
         <w:tc>
           <w:tcPr>
-            <w:tcW w:w="5245" w:type="dxa"/>
+            <w:tcW w:w="4536" w:type="dxa"/>
           </w:tcPr>
           <w:p>
             <w:pPr>
@@ -17882,8 +17961,9 @@
                 <w:rFonts w:hAnsi="바탕"/>
                 <w:noProof/>
                 <w:szCs w:val="20"/>
-              </w:rPr>
-              <w:t>Class 1</w:t>
+                <w:highlight w:val="yellow"/>
+              </w:rPr>
+              <w:t>≤ 20 µm (in air)</w:t>
             </w:r>
           </w:p>
         </w:tc>
@@ -17891,7 +17971,7 @@
       <w:tr>
         <w:tc>
           <w:tcPr>
-            <w:tcW w:w="3260" w:type="dxa"/>
+            <w:tcW w:w="3969" w:type="dxa"/>
           </w:tcPr>
           <w:p>
             <w:pPr>
@@ -17907,13 +17987,13 @@
                 <w:noProof/>
                 <w:szCs w:val="20"/>
               </w:rPr>
-              <w:t>A-Scan rate</w:t>
+              <w:t>Imaging depth</w:t>
             </w:r>
           </w:p>
         </w:tc>
         <w:tc>
           <w:tcPr>
-            <w:tcW w:w="5245" w:type="dxa"/>
+            <w:tcW w:w="4536" w:type="dxa"/>
           </w:tcPr>
           <w:p>
             <w:pPr>
@@ -17930,40 +18010,9 @@
                 <w:rFonts w:hAnsi="바탕"/>
                 <w:noProof/>
                 <w:szCs w:val="20"/>
-              </w:rPr>
-              <w:t>200</w:t>
-            </w:r>
-            <w:r>
-              <w:rPr>
-                <w:rFonts w:hAnsi="바탕"/>
-                <w:noProof/>
-                <w:szCs w:val="20"/>
-              </w:rPr>
-              <w:t xml:space="preserve"> </w:t>
-            </w:r>
-            <w:r>
-              <w:rPr>
-                <w:rFonts w:hAnsi="바탕"/>
-                <w:noProof/>
-                <w:szCs w:val="20"/>
-              </w:rPr>
-              <w:t>kHz ± 10</w:t>
-            </w:r>
-            <w:r>
-              <w:rPr>
-                <w:rFonts w:hAnsi="바탕"/>
-                <w:noProof/>
-                <w:szCs w:val="20"/>
-              </w:rPr>
-              <w:t xml:space="preserve"> </w:t>
-            </w:r>
-            <w:r>
-              <w:rPr>
-                <w:rFonts w:hAnsi="바탕"/>
-                <w:noProof/>
-                <w:szCs w:val="20"/>
-              </w:rPr>
-              <w:t>%</w:t>
+                <w:highlight w:val="yellow"/>
+              </w:rPr>
+              <w:t>≤ 8 mm</w:t>
             </w:r>
           </w:p>
         </w:tc>
@@ -17971,7 +18020,7 @@
       <w:tr>
         <w:tc>
           <w:tcPr>
-            <w:tcW w:w="3260" w:type="dxa"/>
+            <w:tcW w:w="3969" w:type="dxa"/>
           </w:tcPr>
           <w:p>
             <w:pPr>
@@ -17987,20 +18036,22 @@
                 <w:noProof/>
                 <w:szCs w:val="20"/>
               </w:rPr>
-              <w:t>Wavelength</w:t>
+              <w:t>Optical sensitivity</w:t>
             </w:r>
           </w:p>
         </w:tc>
         <w:tc>
           <w:tcPr>
-            <w:tcW w:w="5245" w:type="dxa"/>
+            <w:tcW w:w="4536" w:type="dxa"/>
           </w:tcPr>
           <w:p>
             <w:pPr>
               <w:jc w:val="center"/>
               <w:rPr>
                 <w:rFonts w:hAnsi="바탕"/>
+                <w:noProof/>
                 <w:szCs w:val="20"/>
+                <w:highlight w:val="yellow"/>
               </w:rPr>
             </w:pPr>
             <w:r>
@@ -18008,45 +18059,9 @@
                 <w:rFonts w:hAnsi="바탕"/>
                 <w:noProof/>
                 <w:szCs w:val="20"/>
-              </w:rPr>
-              <w:t xml:space="preserve">1300 </w:t>
-            </w:r>
-            <w:r>
-              <w:rPr>
-                <w:rFonts w:hAnsi="바탕" w:hint="eastAsia"/>
-                <w:noProof/>
-                <w:szCs w:val="20"/>
-              </w:rPr>
-              <w:t>n</w:t>
-            </w:r>
-            <w:r>
-              <w:rPr>
-                <w:rFonts w:hAnsi="바탕"/>
-                <w:noProof/>
-                <w:szCs w:val="20"/>
-              </w:rPr>
-              <w:t xml:space="preserve">m </w:t>
-            </w:r>
-            <w:r>
-              <w:rPr>
-                <w:rFonts w:hAnsi="바탕"/>
-                <w:szCs w:val="20"/>
-              </w:rPr>
-              <w:t>± 50</w:t>
-            </w:r>
-            <w:r>
-              <w:rPr>
-                <w:rFonts w:hAnsi="바탕"/>
-                <w:szCs w:val="20"/>
-              </w:rPr>
-              <w:t xml:space="preserve"> </w:t>
-            </w:r>
-            <w:r>
-              <w:rPr>
-                <w:rFonts w:hAnsi="바탕"/>
-                <w:szCs w:val="20"/>
-              </w:rPr>
-              <w:t>nm</w:t>
+                <w:highlight w:val="yellow"/>
+              </w:rPr>
+              <w:t>≥ 100 dB</w:t>
             </w:r>
           </w:p>
         </w:tc>
@@ -18054,7 +18069,7 @@
       <w:tr>
         <w:tc>
           <w:tcPr>
-            <w:tcW w:w="3260" w:type="dxa"/>
+            <w:tcW w:w="3969" w:type="dxa"/>
           </w:tcPr>
           <w:p>
             <w:pPr>
@@ -18069,26 +18084,20 @@
                 <w:rFonts w:hAnsi="바탕"/>
                 <w:szCs w:val="20"/>
               </w:rPr>
-              <w:t xml:space="preserve">Pullback </w:t>
-            </w:r>
-            <w:r>
-              <w:rPr>
-                <w:rFonts w:hAnsi="바탕"/>
-                <w:szCs w:val="20"/>
-              </w:rPr>
-              <w:t>length</w:t>
+              <w:t>Pullback range</w:t>
             </w:r>
           </w:p>
         </w:tc>
         <w:tc>
           <w:tcPr>
-            <w:tcW w:w="5245" w:type="dxa"/>
+            <w:tcW w:w="4536" w:type="dxa"/>
           </w:tcPr>
           <w:p>
             <w:pPr>
               <w:jc w:val="center"/>
               <w:rPr>
                 <w:rFonts w:hAnsi="바탕"/>
+                <w:noProof/>
                 <w:szCs w:val="20"/>
               </w:rPr>
             </w:pPr>
@@ -18097,27 +18106,41 @@
                 <w:rFonts w:hAnsi="바탕"/>
                 <w:szCs w:val="20"/>
               </w:rPr>
-              <w:t xml:space="preserve">Standard: </w:t>
+              <w:t>50</w:t>
             </w:r>
             <w:r>
               <w:rPr>
                 <w:rFonts w:hAnsi="바탕"/>
                 <w:szCs w:val="20"/>
               </w:rPr>
-              <w:t>6</w:t>
+              <w:t xml:space="preserve"> </w:t>
+            </w:r>
+            <w:r>
+              <w:rPr>
+                <w:rFonts w:hAnsi="바탕" w:hint="eastAsia"/>
+                <w:szCs w:val="20"/>
+              </w:rPr>
+              <w:t>m</w:t>
             </w:r>
             <w:r>
               <w:rPr>
                 <w:rFonts w:hAnsi="바탕"/>
                 <w:szCs w:val="20"/>
               </w:rPr>
-              <w:t>0</w:t>
+              <w:t>m</w:t>
             </w:r>
             <w:r>
               <w:rPr>
                 <w:rFonts w:hAnsi="바탕"/>
                 <w:szCs w:val="20"/>
               </w:rPr>
+              <w:t>, 100</w:t>
+            </w:r>
+            <w:r>
+              <w:rPr>
+                <w:rFonts w:hAnsi="바탕"/>
+                <w:szCs w:val="20"/>
+              </w:rPr>
               <w:t xml:space="preserve"> </w:t>
             </w:r>
             <w:r>
@@ -18133,102 +18156,6 @@
                 <w:szCs w:val="20"/>
               </w:rPr>
               <w:t>m</w:t>
-            </w:r>
-            <w:r>
-              <w:rPr>
-                <w:rFonts w:hAnsi="바탕"/>
-                <w:szCs w:val="20"/>
-              </w:rPr>
-              <w:t>, 100</w:t>
-            </w:r>
-            <w:r>
-              <w:rPr>
-                <w:rFonts w:hAnsi="바탕"/>
-                <w:szCs w:val="20"/>
-              </w:rPr>
-              <w:t xml:space="preserve"> </w:t>
-            </w:r>
-            <w:r>
-              <w:rPr>
-                <w:rFonts w:hAnsi="바탕" w:hint="eastAsia"/>
-                <w:szCs w:val="20"/>
-              </w:rPr>
-              <w:t>m</w:t>
-            </w:r>
-            <w:r>
-              <w:rPr>
-                <w:rFonts w:hAnsi="바탕"/>
-                <w:szCs w:val="20"/>
-              </w:rPr>
-              <w:t>m</w:t>
-            </w:r>
-          </w:p>
-          <w:p>
-            <w:pPr>
-              <w:jc w:val="center"/>
-              <w:rPr>
-                <w:rFonts w:hAnsi="바탕"/>
-                <w:noProof/>
-                <w:szCs w:val="20"/>
-              </w:rPr>
-            </w:pPr>
-            <w:r>
-              <w:rPr>
-                <w:rFonts w:hAnsi="바탕" w:hint="eastAsia"/>
-                <w:noProof/>
-                <w:szCs w:val="20"/>
-              </w:rPr>
-              <w:t>H</w:t>
-            </w:r>
-            <w:r>
-              <w:rPr>
-                <w:rFonts w:hAnsi="바탕"/>
-                <w:noProof/>
-                <w:szCs w:val="20"/>
-              </w:rPr>
-              <w:t xml:space="preserve">igh Resolution: 60 </w:t>
-            </w:r>
-            <w:r>
-              <w:rPr>
-                <w:rFonts w:hAnsi="바탕" w:hint="eastAsia"/>
-                <w:noProof/>
-                <w:szCs w:val="20"/>
-              </w:rPr>
-              <w:t>m</w:t>
-            </w:r>
-            <w:r>
-              <w:rPr>
-                <w:rFonts w:hAnsi="바탕"/>
-                <w:noProof/>
-                <w:szCs w:val="20"/>
-              </w:rPr>
-              <w:t>m, 100mm</w:t>
-            </w:r>
-          </w:p>
-          <w:p>
-            <w:pPr>
-              <w:jc w:val="center"/>
-              <w:rPr>
-                <w:rFonts w:hAnsi="바탕"/>
-                <w:noProof/>
-                <w:szCs w:val="20"/>
-              </w:rPr>
-            </w:pPr>
-            <w:r>
-              <w:rPr>
-                <w:rFonts w:hAnsi="바탕" w:hint="eastAsia"/>
-                <w:noProof/>
-                <w:szCs w:val="20"/>
-              </w:rPr>
-              <w:t>F</w:t>
-            </w:r>
-            <w:r>
-              <w:rPr>
-                <w:rFonts w:hAnsi="바탕"/>
-                <w:noProof/>
-                <w:szCs w:val="20"/>
-              </w:rPr>
-              <w:t>aster: 60 mm</w:t>
             </w:r>
           </w:p>
         </w:tc>
@@ -18236,7 +18163,7 @@
       <w:tr>
         <w:tc>
           <w:tcPr>
-            <w:tcW w:w="3260" w:type="dxa"/>
+            <w:tcW w:w="3969" w:type="dxa"/>
           </w:tcPr>
           <w:p>
             <w:pPr>
@@ -18251,19 +18178,20 @@
                 <w:rFonts w:hAnsi="바탕"/>
                 <w:szCs w:val="20"/>
               </w:rPr>
-              <w:t>Pullback speed</w:t>
+              <w:t>Pullback speed and accuracy</w:t>
             </w:r>
           </w:p>
         </w:tc>
         <w:tc>
           <w:tcPr>
-            <w:tcW w:w="5245" w:type="dxa"/>
+            <w:tcW w:w="4536" w:type="dxa"/>
           </w:tcPr>
           <w:p>
             <w:pPr>
               <w:jc w:val="center"/>
               <w:rPr>
                 <w:rFonts w:hAnsi="바탕"/>
+                <w:noProof/>
                 <w:szCs w:val="20"/>
               </w:rPr>
             </w:pPr>
@@ -18272,257 +18200,77 @@
                 <w:rFonts w:hAnsi="바탕"/>
                 <w:szCs w:val="20"/>
               </w:rPr>
-              <w:t>Standard: 6</w:t>
+              <w:t>20 mm/s</w:t>
             </w:r>
             <w:r>
               <w:rPr>
                 <w:rFonts w:hAnsi="바탕"/>
                 <w:szCs w:val="20"/>
               </w:rPr>
-              <w:t>0 mm/s</w:t>
+              <w:t xml:space="preserve"> </w:t>
             </w:r>
             <w:r>
               <w:rPr>
                 <w:rFonts w:hAnsi="바탕"/>
                 <w:szCs w:val="20"/>
               </w:rPr>
-              <w:t xml:space="preserve"> </w:t>
+              <w:t xml:space="preserve">± </w:t>
             </w:r>
             <w:r>
               <w:rPr>
                 <w:rFonts w:hAnsi="바탕"/>
                 <w:szCs w:val="20"/>
               </w:rPr>
-              <w:t xml:space="preserve">± </w:t>
+              <w:t>5</w:t>
             </w:r>
             <w:r>
               <w:rPr>
                 <w:rFonts w:hAnsi="바탕"/>
                 <w:szCs w:val="20"/>
               </w:rPr>
-              <w:t>5</w:t>
+              <w:t>%</w:t>
             </w:r>
             <w:r>
               <w:rPr>
                 <w:rFonts w:hAnsi="바탕"/>
                 <w:szCs w:val="20"/>
               </w:rPr>
-              <w:t xml:space="preserve"> </w:t>
+              <w:t>, 40</w:t>
+            </w:r>
+            <w:r>
+              <w:rPr>
+                <w:rFonts w:hAnsi="바탕" w:hint="eastAsia"/>
+                <w:szCs w:val="20"/>
+              </w:rPr>
+              <w:t>m</w:t>
             </w:r>
             <w:r>
               <w:rPr>
                 <w:rFonts w:hAnsi="바탕"/>
                 <w:szCs w:val="20"/>
               </w:rPr>
-              <w:t>%</w:t>
+              <w:t>m/s</w:t>
             </w:r>
             <w:r>
               <w:rPr>
                 <w:rFonts w:hAnsi="바탕"/>
                 <w:szCs w:val="20"/>
               </w:rPr>
-              <w:t xml:space="preserve">, </w:t>
+              <w:t xml:space="preserve"> </w:t>
             </w:r>
             <w:r>
               <w:rPr>
                 <w:rFonts w:hAnsi="바탕"/>
                 <w:szCs w:val="20"/>
               </w:rPr>
-              <w:t xml:space="preserve">100 </w:t>
-            </w:r>
-            <w:r>
-              <w:rPr>
-                <w:rFonts w:hAnsi="바탕" w:hint="eastAsia"/>
-                <w:szCs w:val="20"/>
-              </w:rPr>
-              <w:t>m</w:t>
+              <w:t xml:space="preserve">± </w:t>
             </w:r>
             <w:r>
               <w:rPr>
                 <w:rFonts w:hAnsi="바탕"/>
                 <w:szCs w:val="20"/>
               </w:rPr>
-              <w:t>m/s</w:t>
-            </w:r>
-            <w:r>
-              <w:rPr>
-                <w:rFonts w:hAnsi="바탕"/>
-                <w:szCs w:val="20"/>
-              </w:rPr>
-              <w:t xml:space="preserve"> </w:t>
-            </w:r>
-            <w:r>
-              <w:rPr>
-                <w:rFonts w:hAnsi="바탕"/>
-                <w:szCs w:val="20"/>
-              </w:rPr>
-              <w:t xml:space="preserve">± </w:t>
-            </w:r>
-            <w:r>
-              <w:rPr>
-                <w:rFonts w:hAnsi="바탕"/>
-                <w:szCs w:val="20"/>
-              </w:rPr>
               <w:t>5</w:t>
-            </w:r>
-            <w:r>
-              <w:rPr>
-                <w:rFonts w:hAnsi="바탕"/>
-                <w:szCs w:val="20"/>
-              </w:rPr>
-              <w:t xml:space="preserve"> </w:t>
-            </w:r>
-            <w:r>
-              <w:rPr>
-                <w:rFonts w:hAnsi="바탕"/>
-                <w:szCs w:val="20"/>
-              </w:rPr>
-              <w:t>%</w:t>
-            </w:r>
-          </w:p>
-          <w:p>
-            <w:pPr>
-              <w:jc w:val="center"/>
-              <w:rPr>
-                <w:rFonts w:hAnsi="바탕"/>
-                <w:szCs w:val="20"/>
-              </w:rPr>
-            </w:pPr>
-            <w:r>
-              <w:rPr>
-                <w:rFonts w:hAnsi="바탕"/>
-                <w:szCs w:val="20"/>
-              </w:rPr>
-              <w:t>High Resolution: 6</w:t>
-            </w:r>
-            <w:r>
-              <w:rPr>
-                <w:rFonts w:hAnsi="바탕"/>
-                <w:szCs w:val="20"/>
-              </w:rPr>
-              <w:t>0 mm/s</w:t>
-            </w:r>
-            <w:r>
-              <w:rPr>
-                <w:rFonts w:hAnsi="바탕"/>
-                <w:szCs w:val="20"/>
-              </w:rPr>
-              <w:t xml:space="preserve"> </w:t>
-            </w:r>
-            <w:r>
-              <w:rPr>
-                <w:rFonts w:hAnsi="바탕"/>
-                <w:szCs w:val="20"/>
-              </w:rPr>
-              <w:t xml:space="preserve">± </w:t>
-            </w:r>
-            <w:r>
-              <w:rPr>
-                <w:rFonts w:hAnsi="바탕"/>
-                <w:szCs w:val="20"/>
-              </w:rPr>
-              <w:t>5</w:t>
-            </w:r>
-            <w:r>
-              <w:rPr>
-                <w:rFonts w:hAnsi="바탕"/>
-                <w:szCs w:val="20"/>
-              </w:rPr>
-              <w:t xml:space="preserve"> </w:t>
-            </w:r>
-            <w:r>
-              <w:rPr>
-                <w:rFonts w:hAnsi="바탕"/>
-                <w:szCs w:val="20"/>
-              </w:rPr>
-              <w:t>%</w:t>
-            </w:r>
-            <w:r>
-              <w:rPr>
-                <w:rFonts w:hAnsi="바탕"/>
-                <w:szCs w:val="20"/>
-              </w:rPr>
-              <w:t xml:space="preserve">, 100 </w:t>
-            </w:r>
-            <w:r>
-              <w:rPr>
-                <w:rFonts w:hAnsi="바탕" w:hint="eastAsia"/>
-                <w:szCs w:val="20"/>
-              </w:rPr>
-              <w:t>m</w:t>
-            </w:r>
-            <w:r>
-              <w:rPr>
-                <w:rFonts w:hAnsi="바탕"/>
-                <w:szCs w:val="20"/>
-              </w:rPr>
-              <w:t xml:space="preserve">m/s </w:t>
-            </w:r>
-            <w:r>
-              <w:rPr>
-                <w:rFonts w:hAnsi="바탕"/>
-                <w:szCs w:val="20"/>
-              </w:rPr>
-              <w:t xml:space="preserve">± </w:t>
-            </w:r>
-            <w:r>
-              <w:rPr>
-                <w:rFonts w:hAnsi="바탕"/>
-                <w:szCs w:val="20"/>
-              </w:rPr>
-              <w:t>5</w:t>
-            </w:r>
-            <w:r>
-              <w:rPr>
-                <w:rFonts w:hAnsi="바탕"/>
-                <w:szCs w:val="20"/>
-              </w:rPr>
-              <w:t xml:space="preserve"> </w:t>
-            </w:r>
-            <w:r>
-              <w:rPr>
-                <w:rFonts w:hAnsi="바탕"/>
-                <w:szCs w:val="20"/>
-              </w:rPr>
-              <w:t>%</w:t>
-            </w:r>
-          </w:p>
-          <w:p>
-            <w:pPr>
-              <w:jc w:val="center"/>
-              <w:rPr>
-                <w:rFonts w:hAnsi="바탕"/>
-                <w:noProof/>
-                <w:szCs w:val="20"/>
-              </w:rPr>
-            </w:pPr>
-            <w:r>
-              <w:rPr>
-                <w:rFonts w:hAnsi="바탕"/>
-                <w:szCs w:val="20"/>
-              </w:rPr>
-              <w:t xml:space="preserve">Faster: 120 mm/s </w:t>
-            </w:r>
-            <w:r>
-              <w:rPr>
-                <w:rFonts w:hAnsi="바탕"/>
-                <w:szCs w:val="20"/>
-              </w:rPr>
-              <w:t xml:space="preserve">± </w:t>
-            </w:r>
-            <w:r>
-              <w:rPr>
-                <w:rFonts w:hAnsi="바탕"/>
-                <w:szCs w:val="20"/>
-              </w:rPr>
-              <w:t>5</w:t>
-            </w:r>
-            <w:r>
-              <w:rPr>
-                <w:rFonts w:hAnsi="바탕"/>
-                <w:szCs w:val="20"/>
-              </w:rPr>
-              <w:t xml:space="preserve"> </w:t>
             </w:r>
             <w:r>
               <w:rPr>
@@ -18537,7 +18285,7 @@
       <w:tr>
         <w:tc>
           <w:tcPr>
-            <w:tcW w:w="3260" w:type="dxa"/>
+            <w:tcW w:w="3969" w:type="dxa"/>
           </w:tcPr>
           <w:p>
             <w:pPr>
@@ -18552,13 +18300,65 @@
                 <w:rFonts w:hAnsi="바탕"/>
                 <w:szCs w:val="20"/>
               </w:rPr>
-              <w:t>FFR signal test</w:t>
+              <w:t>Rotational speed and accuracy</w:t>
             </w:r>
           </w:p>
         </w:tc>
         <w:tc>
           <w:tcPr>
-            <w:tcW w:w="5245" w:type="dxa"/>
+            <w:tcW w:w="4536" w:type="dxa"/>
+          </w:tcPr>
+          <w:p>
+            <w:pPr>
+              <w:jc w:val="center"/>
+              <w:rPr>
+                <w:rFonts w:hAnsi="바탕"/>
+                <w:noProof/>
+                <w:szCs w:val="20"/>
+              </w:rPr>
+            </w:pPr>
+            <w:r>
+              <w:rPr>
+                <w:rFonts w:hAnsi="바탕"/>
+                <w:szCs w:val="20"/>
+              </w:rPr>
+              <w:t>24</w:t>
+            </w:r>
+            <w:r>
+              <w:rPr>
+                <w:rFonts w:hAnsi="바탕"/>
+                <w:szCs w:val="20"/>
+              </w:rPr>
+              <w:t>000 rpm ± 2 %</w:t>
+            </w:r>
+          </w:p>
+        </w:tc>
+      </w:tr>
+      <w:tr>
+        <w:tc>
+          <w:tcPr>
+            <w:tcW w:w="3969" w:type="dxa"/>
+          </w:tcPr>
+          <w:p>
+            <w:pPr>
+              <w:rPr>
+                <w:rFonts w:hAnsi="바탕"/>
+                <w:noProof/>
+                <w:szCs w:val="20"/>
+              </w:rPr>
+            </w:pPr>
+            <w:r>
+              <w:rPr>
+                <w:rFonts w:hAnsi="바탕"/>
+                <w:szCs w:val="20"/>
+              </w:rPr>
+              <w:t>FFR signal test</w:t>
+            </w:r>
+          </w:p>
+        </w:tc>
+        <w:tc>
+          <w:tcPr>
+            <w:tcW w:w="4536" w:type="dxa"/>
           </w:tcPr>
           <w:p>
             <w:pPr>
@@ -19023,8 +18823,19 @@
                 <w:sz w:val="24"/>
                 <w:shd w:val="clear" w:color="auto" w:fill="FFFFFF"/>
               </w:rPr>
-              <w:t>™ 3060 Ti</w:t>
-            </w:r>
+              <w:t xml:space="preserve">™ 3060 </w:t>
+            </w:r>
+            <w:proofErr w:type="spellStart"/>
+            <w:r>
+              <w:rPr>
+                <w:rFonts w:asciiTheme="minorHAnsi" w:eastAsiaTheme="minorHAnsi" w:hAnsiTheme="minorHAnsi" w:cs="Arial"/>
+                <w:color w:val="202020"/>
+                <w:sz w:val="24"/>
+                <w:shd w:val="clear" w:color="auto" w:fill="FFFFFF"/>
+              </w:rPr>
+              <w:t>Ti</w:t>
+            </w:r>
+            <w:proofErr w:type="spellEnd"/>
           </w:p>
         </w:tc>
       </w:tr>
@@ -19058,7 +18869,6 @@
                 <w:rFonts w:asciiTheme="minorHAnsi" w:eastAsiaTheme="minorHAnsi" w:hAnsiTheme="minorHAnsi" w:cs="Arial"/>
                 <w:sz w:val="24"/>
               </w:rPr>
-              <w:lastRenderedPageBreak/>
               <w:t>Memory</w:t>
             </w:r>
           </w:p>
@@ -19142,6 +18952,7 @@
                 <w:rFonts w:asciiTheme="minorHAnsi" w:eastAsiaTheme="minorHAnsi" w:hAnsiTheme="minorHAnsi" w:cs="Arial"/>
                 <w:sz w:val="24"/>
               </w:rPr>
+              <w:lastRenderedPageBreak/>
               <w:t>Storage</w:t>
             </w:r>
           </w:p>
@@ -19406,7 +19217,7 @@
                 <w:rFonts w:ascii="Arial" w:eastAsiaTheme="minorHAnsi" w:hAnsi="Arial" w:cs="Arial"/>
                 <w:sz w:val="24"/>
               </w:rPr>
-              <w:t>FasterDx</w:t>
+              <w:t>Rudens</w:t>
             </w:r>
             <w:proofErr w:type="spellEnd"/>
           </w:p>
@@ -31473,12 +31284,14 @@
               <w:rPr>
                 <w:rFonts w:ascii="Arial" w:eastAsia="맑은 고딕" w:hAnsi="Arial" w:cs="Arial"/>
                 <w:sz w:val="24"/>
+                <w:highlight w:val="yellow"/>
               </w:rPr>
             </w:pPr>
             <w:r>
               <w:rPr>
                 <w:rFonts w:ascii="Arial" w:eastAsia="맑은 고딕" w:hAnsi="Arial" w:cs="Arial"/>
                 <w:sz w:val="24"/>
+                <w:highlight w:val="yellow"/>
               </w:rPr>
               <w:t>202</w:t>
             </w:r>
@@ -31486,6 +31299,7 @@
               <w:rPr>
                 <w:rFonts w:ascii="Arial" w:eastAsia="맑은 고딕" w:hAnsi="Arial" w:cs="Arial"/>
                 <w:sz w:val="24"/>
+                <w:highlight w:val="yellow"/>
               </w:rPr>
               <w:t>2</w:t>
             </w:r>
@@ -31493,6 +31307,7 @@
               <w:rPr>
                 <w:rFonts w:ascii="Arial" w:eastAsia="맑은 고딕" w:hAnsi="Arial" w:cs="Arial"/>
                 <w:sz w:val="24"/>
+                <w:highlight w:val="yellow"/>
               </w:rPr>
               <w:t>.0</w:t>
             </w:r>
@@ -31500,6 +31315,7 @@
               <w:rPr>
                 <w:rFonts w:ascii="Arial" w:eastAsia="맑은 고딕" w:hAnsi="Arial" w:cs="Arial"/>
                 <w:sz w:val="24"/>
+                <w:highlight w:val="yellow"/>
               </w:rPr>
               <w:t>7</w:t>
             </w:r>
@@ -31507,6 +31323,7 @@
               <w:rPr>
                 <w:rFonts w:ascii="Arial" w:eastAsia="맑은 고딕" w:hAnsi="Arial" w:cs="Arial"/>
                 <w:sz w:val="24"/>
+                <w:highlight w:val="yellow"/>
               </w:rPr>
               <w:t xml:space="preserve"> ~ 202</w:t>
             </w:r>
@@ -31514,6 +31331,7 @@
               <w:rPr>
                 <w:rFonts w:ascii="Arial" w:eastAsia="맑은 고딕" w:hAnsi="Arial" w:cs="Arial"/>
                 <w:sz w:val="24"/>
+                <w:highlight w:val="yellow"/>
               </w:rPr>
               <w:t>2</w:t>
             </w:r>
@@ -31521,6 +31339,7 @@
               <w:rPr>
                 <w:rFonts w:ascii="Arial" w:eastAsia="맑은 고딕" w:hAnsi="Arial" w:cs="Arial"/>
                 <w:sz w:val="24"/>
+                <w:highlight w:val="yellow"/>
               </w:rPr>
               <w:t>.0</w:t>
             </w:r>
@@ -31528,6 +31347,7 @@
               <w:rPr>
                 <w:rFonts w:ascii="Arial" w:eastAsia="맑은 고딕" w:hAnsi="Arial" w:cs="Arial"/>
                 <w:sz w:val="24"/>
+                <w:highlight w:val="yellow"/>
               </w:rPr>
               <w:t>8</w:t>
             </w:r>
@@ -31689,12 +31509,14 @@
               <w:rPr>
                 <w:rFonts w:ascii="Arial" w:eastAsia="맑은 고딕" w:hAnsi="Arial" w:cs="Arial"/>
                 <w:sz w:val="24"/>
+                <w:highlight w:val="yellow"/>
               </w:rPr>
             </w:pPr>
             <w:r>
               <w:rPr>
                 <w:rFonts w:ascii="Arial" w:eastAsia="맑은 고딕" w:hAnsi="Arial" w:cs="Arial"/>
                 <w:sz w:val="24"/>
+                <w:highlight w:val="yellow"/>
               </w:rPr>
               <w:t>202</w:t>
             </w:r>
@@ -31702,6 +31524,7 @@
               <w:rPr>
                 <w:rFonts w:ascii="Arial" w:eastAsia="맑은 고딕" w:hAnsi="Arial" w:cs="Arial"/>
                 <w:sz w:val="24"/>
+                <w:highlight w:val="yellow"/>
               </w:rPr>
               <w:t>2</w:t>
             </w:r>
@@ -31709,6 +31532,7 @@
               <w:rPr>
                 <w:rFonts w:ascii="Arial" w:eastAsia="맑은 고딕" w:hAnsi="Arial" w:cs="Arial"/>
                 <w:sz w:val="24"/>
+                <w:highlight w:val="yellow"/>
               </w:rPr>
               <w:t>.0</w:t>
             </w:r>
@@ -31716,6 +31540,7 @@
               <w:rPr>
                 <w:rFonts w:ascii="Arial" w:eastAsia="맑은 고딕" w:hAnsi="Arial" w:cs="Arial"/>
                 <w:sz w:val="24"/>
+                <w:highlight w:val="yellow"/>
               </w:rPr>
               <w:t>8</w:t>
             </w:r>
@@ -31723,6 +31548,7 @@
               <w:rPr>
                 <w:rFonts w:ascii="Arial" w:eastAsia="맑은 고딕" w:hAnsi="Arial" w:cs="Arial"/>
                 <w:sz w:val="24"/>
+                <w:highlight w:val="yellow"/>
               </w:rPr>
               <w:t xml:space="preserve"> ~ 202</w:t>
             </w:r>
@@ -31730,6 +31556,7 @@
               <w:rPr>
                 <w:rFonts w:ascii="Arial" w:eastAsia="맑은 고딕" w:hAnsi="Arial" w:cs="Arial"/>
                 <w:sz w:val="24"/>
+                <w:highlight w:val="yellow"/>
               </w:rPr>
               <w:t>2</w:t>
             </w:r>
@@ -31737,6 +31564,7 @@
               <w:rPr>
                 <w:rFonts w:ascii="Arial" w:eastAsia="맑은 고딕" w:hAnsi="Arial" w:cs="Arial"/>
                 <w:sz w:val="24"/>
+                <w:highlight w:val="yellow"/>
               </w:rPr>
               <w:t>.0</w:t>
             </w:r>
@@ -31744,6 +31572,7 @@
               <w:rPr>
                 <w:rFonts w:ascii="Arial" w:eastAsia="맑은 고딕" w:hAnsi="Arial" w:cs="Arial"/>
                 <w:sz w:val="24"/>
+                <w:highlight w:val="yellow"/>
               </w:rPr>
               <w:t>9</w:t>
             </w:r>
@@ -31983,12 +31812,14 @@
               <w:rPr>
                 <w:rFonts w:ascii="Arial" w:eastAsia="맑은 고딕" w:hAnsi="Arial" w:cs="Arial"/>
                 <w:sz w:val="24"/>
+                <w:highlight w:val="yellow"/>
               </w:rPr>
             </w:pPr>
             <w:r>
               <w:rPr>
                 <w:rFonts w:ascii="Arial" w:eastAsia="맑은 고딕" w:hAnsi="Arial" w:cs="Arial"/>
                 <w:sz w:val="24"/>
+                <w:highlight w:val="yellow"/>
               </w:rPr>
               <w:t>202</w:t>
             </w:r>
@@ -31996,6 +31827,7 @@
               <w:rPr>
                 <w:rFonts w:ascii="Arial" w:eastAsia="맑은 고딕" w:hAnsi="Arial" w:cs="Arial"/>
                 <w:sz w:val="24"/>
+                <w:highlight w:val="yellow"/>
               </w:rPr>
               <w:t>2</w:t>
             </w:r>
@@ -32003,6 +31835,7 @@
               <w:rPr>
                 <w:rFonts w:ascii="Arial" w:eastAsia="맑은 고딕" w:hAnsi="Arial" w:cs="Arial"/>
                 <w:sz w:val="24"/>
+                <w:highlight w:val="yellow"/>
               </w:rPr>
               <w:t>.</w:t>
             </w:r>
@@ -32010,6 +31843,7 @@
               <w:rPr>
                 <w:rFonts w:ascii="Arial" w:eastAsia="맑은 고딕" w:hAnsi="Arial" w:cs="Arial"/>
                 <w:sz w:val="24"/>
+                <w:highlight w:val="yellow"/>
               </w:rPr>
               <w:t>10</w:t>
             </w:r>
@@ -32017,6 +31851,7 @@
               <w:rPr>
                 <w:rFonts w:ascii="Arial" w:eastAsia="맑은 고딕" w:hAnsi="Arial" w:cs="Arial"/>
                 <w:sz w:val="24"/>
+                <w:highlight w:val="yellow"/>
               </w:rPr>
               <w:t xml:space="preserve"> ~ 202</w:t>
             </w:r>
@@ -32024,6 +31859,7 @@
               <w:rPr>
                 <w:rFonts w:ascii="Arial" w:eastAsia="맑은 고딕" w:hAnsi="Arial" w:cs="Arial"/>
                 <w:sz w:val="24"/>
+                <w:highlight w:val="yellow"/>
               </w:rPr>
               <w:t>3</w:t>
             </w:r>
@@ -32031,6 +31867,7 @@
               <w:rPr>
                 <w:rFonts w:ascii="Arial" w:eastAsia="맑은 고딕" w:hAnsi="Arial" w:cs="Arial"/>
                 <w:sz w:val="24"/>
+                <w:highlight w:val="yellow"/>
               </w:rPr>
               <w:t>.</w:t>
             </w:r>
@@ -32038,15 +31875,9 @@
               <w:rPr>
                 <w:rFonts w:ascii="Arial" w:eastAsia="맑은 고딕" w:hAnsi="Arial" w:cs="Arial"/>
                 <w:sz w:val="24"/>
-              </w:rPr>
-              <w:t>0</w:t>
-            </w:r>
-            <w:r>
-              <w:rPr>
-                <w:rFonts w:ascii="Arial" w:eastAsia="맑은 고딕" w:hAnsi="Arial" w:cs="Arial"/>
-                <w:sz w:val="24"/>
-              </w:rPr>
-              <w:t>5</w:t>
+                <w:highlight w:val="yellow"/>
+              </w:rPr>
+              <w:t>04</w:t>
             </w:r>
           </w:p>
         </w:tc>
@@ -32248,35 +32079,72 @@
               <w:rPr>
                 <w:rFonts w:ascii="Arial" w:eastAsia="맑은 고딕" w:hAnsi="Arial" w:cs="Arial"/>
                 <w:sz w:val="24"/>
+                <w:highlight w:val="yellow"/>
               </w:rPr>
             </w:pPr>
             <w:r>
               <w:rPr>
                 <w:rFonts w:ascii="Arial" w:eastAsia="맑은 고딕" w:hAnsi="Arial" w:cs="Arial"/>
                 <w:sz w:val="24"/>
-              </w:rPr>
-              <w:t>2023.0</w:t>
+                <w:highlight w:val="yellow"/>
+              </w:rPr>
+              <w:t>202</w:t>
             </w:r>
             <w:r>
               <w:rPr>
                 <w:rFonts w:ascii="Arial" w:eastAsia="맑은 고딕" w:hAnsi="Arial" w:cs="Arial"/>
                 <w:sz w:val="24"/>
-              </w:rPr>
-              <w:t>6</w:t>
+                <w:highlight w:val="yellow"/>
+              </w:rPr>
+              <w:t>3</w:t>
             </w:r>
             <w:r>
               <w:rPr>
                 <w:rFonts w:ascii="Arial" w:eastAsia="맑은 고딕" w:hAnsi="Arial" w:cs="Arial"/>
                 <w:sz w:val="24"/>
-              </w:rPr>
-              <w:t xml:space="preserve"> ~ 2023.0</w:t>
+                <w:highlight w:val="yellow"/>
+              </w:rPr>
+              <w:t>.0</w:t>
             </w:r>
             <w:r>
               <w:rPr>
                 <w:rFonts w:ascii="Arial" w:eastAsia="맑은 고딕" w:hAnsi="Arial" w:cs="Arial"/>
                 <w:sz w:val="24"/>
-              </w:rPr>
-              <w:t>7</w:t>
+                <w:highlight w:val="yellow"/>
+              </w:rPr>
+              <w:t>5</w:t>
+            </w:r>
+            <w:r>
+              <w:rPr>
+                <w:rFonts w:ascii="Arial" w:eastAsia="맑은 고딕" w:hAnsi="Arial" w:cs="Arial"/>
+                <w:sz w:val="24"/>
+                <w:highlight w:val="yellow"/>
+              </w:rPr>
+              <w:t xml:space="preserve"> ~ 202</w:t>
+            </w:r>
+            <w:r>
+              <w:rPr>
+                <w:rFonts w:ascii="Arial" w:eastAsia="맑은 고딕" w:hAnsi="Arial" w:cs="Arial"/>
+                <w:sz w:val="24"/>
+                <w:highlight w:val="yellow"/>
+              </w:rPr>
+              <w:t>3</w:t>
+            </w:r>
+            <w:r>
+              <w:rPr>
+                <w:rFonts w:ascii="Arial" w:eastAsia="맑은 고딕" w:hAnsi="Arial" w:cs="Arial"/>
+                <w:sz w:val="24"/>
+                <w:highlight w:val="yellow"/>
+              </w:rPr>
+              <w:t>.</w:t>
+            </w:r>
+            <w:r>
+              <w:rPr>
+                <w:rFonts w:ascii="Arial" w:eastAsia="맑은 고딕" w:hAnsi="Arial" w:cs="Arial"/>
+                <w:sz w:val="24"/>
+                <w:highlight w:val="yellow"/>
+              </w:rPr>
+              <w:t>06</w:t>
             </w:r>
           </w:p>
         </w:tc>
@@ -32422,35 +32290,72 @@
               <w:rPr>
                 <w:rFonts w:ascii="Arial" w:eastAsia="맑은 고딕" w:hAnsi="Arial" w:cs="Arial"/>
                 <w:sz w:val="24"/>
+                <w:highlight w:val="yellow"/>
               </w:rPr>
             </w:pPr>
             <w:r>
               <w:rPr>
                 <w:rFonts w:ascii="Arial" w:eastAsia="맑은 고딕" w:hAnsi="Arial" w:cs="Arial"/>
                 <w:sz w:val="24"/>
-              </w:rPr>
-              <w:t>2023.0</w:t>
+                <w:highlight w:val="yellow"/>
+              </w:rPr>
+              <w:t>202</w:t>
             </w:r>
             <w:r>
               <w:rPr>
                 <w:rFonts w:ascii="Arial" w:eastAsia="맑은 고딕" w:hAnsi="Arial" w:cs="Arial"/>
                 <w:sz w:val="24"/>
-              </w:rPr>
-              <w:t>8</w:t>
+                <w:highlight w:val="yellow"/>
+              </w:rPr>
+              <w:t>3</w:t>
             </w:r>
             <w:r>
               <w:rPr>
                 <w:rFonts w:ascii="Arial" w:eastAsia="맑은 고딕" w:hAnsi="Arial" w:cs="Arial"/>
                 <w:sz w:val="24"/>
-              </w:rPr>
-              <w:t xml:space="preserve"> ~ 2023.0</w:t>
+                <w:highlight w:val="yellow"/>
+              </w:rPr>
+              <w:t>.</w:t>
             </w:r>
             <w:r>
               <w:rPr>
                 <w:rFonts w:ascii="Arial" w:eastAsia="맑은 고딕" w:hAnsi="Arial" w:cs="Arial"/>
                 <w:sz w:val="24"/>
-              </w:rPr>
-              <w:t>8</w:t>
+                <w:highlight w:val="yellow"/>
+              </w:rPr>
+              <w:t>07</w:t>
+            </w:r>
+            <w:r>
+              <w:rPr>
+                <w:rFonts w:ascii="Arial" w:eastAsia="맑은 고딕" w:hAnsi="Arial" w:cs="Arial"/>
+                <w:sz w:val="24"/>
+                <w:highlight w:val="yellow"/>
+              </w:rPr>
+              <w:t xml:space="preserve"> ~ 202</w:t>
+            </w:r>
+            <w:r>
+              <w:rPr>
+                <w:rFonts w:ascii="Arial" w:eastAsia="맑은 고딕" w:hAnsi="Arial" w:cs="Arial"/>
+                <w:sz w:val="24"/>
+                <w:highlight w:val="yellow"/>
+              </w:rPr>
+              <w:t>3</w:t>
+            </w:r>
+            <w:r>
+              <w:rPr>
+                <w:rFonts w:ascii="Arial" w:eastAsia="맑은 고딕" w:hAnsi="Arial" w:cs="Arial"/>
+                <w:sz w:val="24"/>
+                <w:highlight w:val="yellow"/>
+              </w:rPr>
+              <w:t>.</w:t>
+            </w:r>
+            <w:r>
+              <w:rPr>
+                <w:rFonts w:ascii="Arial" w:eastAsia="맑은 고딕" w:hAnsi="Arial" w:cs="Arial"/>
+                <w:sz w:val="24"/>
+                <w:highlight w:val="yellow"/>
+              </w:rPr>
+              <w:t>07</w:t>
             </w:r>
           </w:p>
         </w:tc>
@@ -32567,10 +32472,10 @@
               <w:noProof/>
             </w:rPr>
             <w:drawing>
-              <wp:inline distT="0" distB="0" distL="0" distR="0" wp14:anchorId="62DA9F19" wp14:editId="4DD81D8F">
-                <wp:extent cx="1203960" cy="282575"/>
-                <wp:effectExtent l="0" t="0" r="0" b="3175"/>
-                <wp:docPr id="1661057438" name="그림 1"/>
+              <wp:inline distT="0" distB="0" distL="0" distR="0" wp14:anchorId="33F8998D" wp14:editId="122BEA95">
+                <wp:extent cx="1203960" cy="264160"/>
+                <wp:effectExtent l="0" t="0" r="0" b="2540"/>
+                <wp:docPr id="545576413" name="그림 1"/>
                 <wp:cNvGraphicFramePr>
                   <a:graphicFrameLocks xmlns:a="http://schemas.openxmlformats.org/drawingml/2006/main" noChangeAspect="1"/>
                 </wp:cNvGraphicFramePr>
@@ -32599,7 +32504,7 @@
                       <pic:spPr bwMode="auto">
                         <a:xfrm>
                           <a:off x="0" y="0"/>
-                          <a:ext cx="1203960" cy="282575"/>
+                          <a:ext cx="1203960" cy="264160"/>
                         </a:xfrm>
                         <a:prstGeom prst="rect">
                           <a:avLst/>

</xml_diff>